<commit_message>
docs: add charts to AdaFace training report
Generate 6 matplotlib figures from results_adaface.json and embed them
in the report alongside the existing tables:
  - Training curve (loss vs LFW accuracy over 30 epochs)
  - Baseline vs AdaFace LFW comparison
  - LFW confusion matrix heatmap
  - Per-benchmark accuracy bar chart (8 benchmarks, ±std)
  - Grouped Accuracy/Precision/Recall/F1 per benchmark
  - Positive vs negative similarity spread

Figures are generated by generate_figures.py into report_figs/ and
embedded by generate_report.py.

Co-Authored-By: Claude Opus 4.8 <noreply@anthropic.com>
Claude-Session: https://claude.ai/code/session_01U43wBSH37FjU3XqAi8Nr1K
</commit_message>
<xml_diff>
--- a/AdaFace_Training_Report.docx
+++ b/AdaFace_Training_Report.docx
@@ -1899,6 +1899,59 @@
     </w:tbl>
     <w:p/>
     <w:p>
+      <w:pPr>
+        <w:jc w:val="center"/>
+      </w:pPr>
+      <w:r>
+        <w:drawing>
+          <wp:inline xmlns:a="http://schemas.openxmlformats.org/drawingml/2006/main" xmlns:pic="http://schemas.openxmlformats.org/drawingml/2006/picture">
+            <wp:extent cx="5580000" cy="3328343"/>
+            <wp:docPr id="1" name="Picture 1"/>
+            <wp:cNvGraphicFramePr>
+              <a:graphicFrameLocks noChangeAspect="1"/>
+            </wp:cNvGraphicFramePr>
+            <a:graphic>
+              <a:graphicData uri="http://schemas.openxmlformats.org/drawingml/2006/picture">
+                <pic:pic>
+                  <pic:nvPicPr>
+                    <pic:cNvPr id="0" name="fig4_training_curve.png"/>
+                    <pic:cNvPicPr/>
+                  </pic:nvPicPr>
+                  <pic:blipFill>
+                    <a:blip r:embed="rId9"/>
+                    <a:stretch>
+                      <a:fillRect/>
+                    </a:stretch>
+                  </pic:blipFill>
+                  <pic:spPr>
+                    <a:xfrm>
+                      <a:off x="0" y="0"/>
+                      <a:ext cx="5580000" cy="3328343"/>
+                    </a:xfrm>
+                    <a:prstGeom prst="rect"/>
+                  </pic:spPr>
+                </pic:pic>
+              </a:graphicData>
+            </a:graphic>
+          </wp:inline>
+        </w:drawing>
+      </w:r>
+    </w:p>
+    <w:p>
+      <w:pPr>
+        <w:jc w:val="center"/>
+      </w:pPr>
+      <w:r>
+        <w:rPr>
+          <w:i/>
+          <w:color w:val="555555"/>
+          <w:sz w:val="18"/>
+        </w:rPr>
+        <w:t>Figure 1. Training loss (red) falls from ~3.2 to ~0.4 while LFW accuracy (blue) climbs from ~78% to ~99% over 30 epochs. Dotted lines mark the MultiStep LR decays at epochs 16, 24, 28.</w:t>
+      </w:r>
+    </w:p>
+    <w:p/>
+    <w:p>
       <w:r>
         <w:rPr>
           <w:b w:val="0"/>
@@ -2119,6 +2172,59 @@
           <w:sz w:val="22"/>
         </w:rPr>
         <w:t>This is equivalent to curriculum hard-mining without explicit triplet selection, and it is the primary reason the AdaFace model (99.3% LFW) outperforms the earlier CE+triplet baseline (90.9% LFW) by ~8.4 percentage points.</w:t>
+      </w:r>
+    </w:p>
+    <w:p/>
+    <w:p>
+      <w:pPr>
+        <w:jc w:val="center"/>
+      </w:pPr>
+      <w:r>
+        <w:drawing>
+          <wp:inline xmlns:a="http://schemas.openxmlformats.org/drawingml/2006/main" xmlns:pic="http://schemas.openxmlformats.org/drawingml/2006/picture">
+            <wp:extent cx="3960000" cy="3209589"/>
+            <wp:docPr id="2" name="Picture 2"/>
+            <wp:cNvGraphicFramePr>
+              <a:graphicFrameLocks noChangeAspect="1"/>
+            </wp:cNvGraphicFramePr>
+            <a:graphic>
+              <a:graphicData uri="http://schemas.openxmlformats.org/drawingml/2006/picture">
+                <pic:pic>
+                  <pic:nvPicPr>
+                    <pic:cNvPr id="0" name="fig6_baseline_vs_adaface.png"/>
+                    <pic:cNvPicPr/>
+                  </pic:nvPicPr>
+                  <pic:blipFill>
+                    <a:blip r:embed="rId10"/>
+                    <a:stretch>
+                      <a:fillRect/>
+                    </a:stretch>
+                  </pic:blipFill>
+                  <pic:spPr>
+                    <a:xfrm>
+                      <a:off x="0" y="0"/>
+                      <a:ext cx="3960000" cy="3209589"/>
+                    </a:xfrm>
+                    <a:prstGeom prst="rect"/>
+                  </pic:spPr>
+                </pic:pic>
+              </a:graphicData>
+            </a:graphic>
+          </wp:inline>
+        </w:drawing>
+      </w:r>
+    </w:p>
+    <w:p>
+      <w:pPr>
+        <w:jc w:val="center"/>
+      </w:pPr>
+      <w:r>
+        <w:rPr>
+          <w:i/>
+          <w:color w:val="555555"/>
+          <w:sz w:val="18"/>
+        </w:rPr>
+        <w:t>Figure 2. LFW accuracy of the earlier CE+triplet baseline vs the IResNet50 + AdaFace model — an +8.4 percentage-point improvement.</w:t>
       </w:r>
     </w:p>
     <w:p/>
@@ -3237,6 +3343,59 @@
     <w:p/>
     <w:p>
       <w:pPr>
+        <w:jc w:val="center"/>
+      </w:pPr>
+      <w:r>
+        <w:drawing>
+          <wp:inline xmlns:a="http://schemas.openxmlformats.org/drawingml/2006/main" xmlns:pic="http://schemas.openxmlformats.org/drawingml/2006/picture">
+            <wp:extent cx="3600000" cy="2579868"/>
+            <wp:docPr id="3" name="Picture 3"/>
+            <wp:cNvGraphicFramePr>
+              <a:graphicFrameLocks noChangeAspect="1"/>
+            </wp:cNvGraphicFramePr>
+            <a:graphic>
+              <a:graphicData uri="http://schemas.openxmlformats.org/drawingml/2006/picture">
+                <pic:pic>
+                  <pic:nvPicPr>
+                    <pic:cNvPr id="0" name="fig3_lfw_confusion.png"/>
+                    <pic:cNvPicPr/>
+                  </pic:nvPicPr>
+                  <pic:blipFill>
+                    <a:blip r:embed="rId11"/>
+                    <a:stretch>
+                      <a:fillRect/>
+                    </a:stretch>
+                  </pic:blipFill>
+                  <pic:spPr>
+                    <a:xfrm>
+                      <a:off x="0" y="0"/>
+                      <a:ext cx="3600000" cy="2579868"/>
+                    </a:xfrm>
+                    <a:prstGeom prst="rect"/>
+                  </pic:spPr>
+                </pic:pic>
+              </a:graphicData>
+            </a:graphic>
+          </wp:inline>
+        </w:drawing>
+      </w:r>
+    </w:p>
+    <w:p>
+      <w:pPr>
+        <w:jc w:val="center"/>
+      </w:pPr>
+      <w:r>
+        <w:rPr>
+          <w:i/>
+          <w:color w:val="555555"/>
+          <w:sz w:val="18"/>
+        </w:rPr>
+        <w:t>Figure 3. LFW confusion matrix at τ = 0.237. Only 11 false positives and 26 false negatives out of 6,000 pairs.</w:t>
+      </w:r>
+    </w:p>
+    <w:p/>
+    <w:p>
+      <w:pPr>
         <w:pStyle w:val="Heading2"/>
         <w:jc w:val="left"/>
       </w:pPr>
@@ -4234,6 +4393,165 @@
     </w:tbl>
     <w:p/>
     <w:p>
+      <w:pPr>
+        <w:jc w:val="center"/>
+      </w:pPr>
+      <w:r>
+        <w:drawing>
+          <wp:inline xmlns:a="http://schemas.openxmlformats.org/drawingml/2006/main" xmlns:pic="http://schemas.openxmlformats.org/drawingml/2006/picture">
+            <wp:extent cx="5580000" cy="3595681"/>
+            <wp:docPr id="4" name="Picture 4"/>
+            <wp:cNvGraphicFramePr>
+              <a:graphicFrameLocks noChangeAspect="1"/>
+            </wp:cNvGraphicFramePr>
+            <a:graphic>
+              <a:graphicData uri="http://schemas.openxmlformats.org/drawingml/2006/picture">
+                <pic:pic>
+                  <pic:nvPicPr>
+                    <pic:cNvPr id="0" name="fig1_benchmark_accuracy.png"/>
+                    <pic:cNvPicPr/>
+                  </pic:nvPicPr>
+                  <pic:blipFill>
+                    <a:blip r:embed="rId12"/>
+                    <a:stretch>
+                      <a:fillRect/>
+                    </a:stretch>
+                  </pic:blipFill>
+                  <pic:spPr>
+                    <a:xfrm>
+                      <a:off x="0" y="0"/>
+                      <a:ext cx="5580000" cy="3595681"/>
+                    </a:xfrm>
+                    <a:prstGeom prst="rect"/>
+                  </pic:spPr>
+                </pic:pic>
+              </a:graphicData>
+            </a:graphic>
+          </wp:inline>
+        </w:drawing>
+      </w:r>
+    </w:p>
+    <w:p>
+      <w:pPr>
+        <w:jc w:val="center"/>
+      </w:pPr>
+      <w:r>
+        <w:rPr>
+          <w:i/>
+          <w:color w:val="555555"/>
+          <w:sz w:val="18"/>
+        </w:rPr>
+        <w:t>Figure 4. Verification accuracy across all 8 benchmarks (10-fold CV, error bars = ±std). Green ≥ 97%, blue ≥ 92%, orange = profile/pose, red = adversarial failure (TALFW).</w:t>
+      </w:r>
+    </w:p>
+    <w:p/>
+    <w:p>
+      <w:pPr>
+        <w:jc w:val="center"/>
+      </w:pPr>
+      <w:r>
+        <w:drawing>
+          <wp:inline xmlns:a="http://schemas.openxmlformats.org/drawingml/2006/main" xmlns:pic="http://schemas.openxmlformats.org/drawingml/2006/picture">
+            <wp:extent cx="5580000" cy="3176966"/>
+            <wp:docPr id="5" name="Picture 5"/>
+            <wp:cNvGraphicFramePr>
+              <a:graphicFrameLocks noChangeAspect="1"/>
+            </wp:cNvGraphicFramePr>
+            <a:graphic>
+              <a:graphicData uri="http://schemas.openxmlformats.org/drawingml/2006/picture">
+                <pic:pic>
+                  <pic:nvPicPr>
+                    <pic:cNvPr id="0" name="fig2_metrics_grouped.png"/>
+                    <pic:cNvPicPr/>
+                  </pic:nvPicPr>
+                  <pic:blipFill>
+                    <a:blip r:embed="rId13"/>
+                    <a:stretch>
+                      <a:fillRect/>
+                    </a:stretch>
+                  </pic:blipFill>
+                  <pic:spPr>
+                    <a:xfrm>
+                      <a:off x="0" y="0"/>
+                      <a:ext cx="5580000" cy="3176966"/>
+                    </a:xfrm>
+                    <a:prstGeom prst="rect"/>
+                  </pic:spPr>
+                </pic:pic>
+              </a:graphicData>
+            </a:graphic>
+          </wp:inline>
+        </w:drawing>
+      </w:r>
+    </w:p>
+    <w:p>
+      <w:pPr>
+        <w:jc w:val="center"/>
+      </w:pPr>
+      <w:r>
+        <w:rPr>
+          <w:i/>
+          <w:color w:val="555555"/>
+          <w:sz w:val="18"/>
+        </w:rPr>
+        <w:t>Figure 5. Accuracy, Precision, Recall, and F1 side-by-side per benchmark (adversarial TALFW excluded). Precision consistently exceeds recall — the model is conservative, favouring false rejects over false accepts.</w:t>
+      </w:r>
+    </w:p>
+    <w:p/>
+    <w:p>
+      <w:pPr>
+        <w:jc w:val="center"/>
+      </w:pPr>
+      <w:r>
+        <w:drawing>
+          <wp:inline xmlns:a="http://schemas.openxmlformats.org/drawingml/2006/main" xmlns:pic="http://schemas.openxmlformats.org/drawingml/2006/picture">
+            <wp:extent cx="5580000" cy="3447954"/>
+            <wp:docPr id="6" name="Picture 6"/>
+            <wp:cNvGraphicFramePr>
+              <a:graphicFrameLocks noChangeAspect="1"/>
+            </wp:cNvGraphicFramePr>
+            <a:graphic>
+              <a:graphicData uri="http://schemas.openxmlformats.org/drawingml/2006/picture">
+                <pic:pic>
+                  <pic:nvPicPr>
+                    <pic:cNvPr id="0" name="fig5_pos_neg_spread.png"/>
+                    <pic:cNvPicPr/>
+                  </pic:nvPicPr>
+                  <pic:blipFill>
+                    <a:blip r:embed="rId14"/>
+                    <a:stretch>
+                      <a:fillRect/>
+                    </a:stretch>
+                  </pic:blipFill>
+                  <pic:spPr>
+                    <a:xfrm>
+                      <a:off x="0" y="0"/>
+                      <a:ext cx="5580000" cy="3447954"/>
+                    </a:xfrm>
+                    <a:prstGeom prst="rect"/>
+                  </pic:spPr>
+                </pic:pic>
+              </a:graphicData>
+            </a:graphic>
+          </wp:inline>
+        </w:drawing>
+      </w:r>
+    </w:p>
+    <w:p>
+      <w:pPr>
+        <w:jc w:val="center"/>
+      </w:pPr>
+      <w:r>
+        <w:rPr>
+          <w:i/>
+          <w:color w:val="555555"/>
+          <w:sz w:val="18"/>
+        </w:rPr>
+        <w:t>Figure 6. Mean cosine similarity of positive vs negative pairs. The spread Δ measures how separable the embedding space is — it collapses to negative on TALFW, explaining the adversarial failure.</w:t>
+      </w:r>
+    </w:p>
+    <w:p/>
+    <w:p>
       <w:r>
         <w:rPr>
           <w:b w:val="0"/>

</xml_diff>